<commit_message>
Set sponsorship amount to $2,000 (100 authorized hours)
Fill the decided figures into Section 6.2, Section 6.3, and Exhibit A of the
agreement ($2,000.00 max gross compensation; 100 hours at $20.00/hr) and update
the README. Kept the 'sponsorship / Maximum Compensation' framing rather than
'scholarship' to preserve the work-for-wages structure.

Co-Authored-By: Claude Opus 4.8 <noreply@anthropic.com>
Claude-Session: https://claude.ai/code/session_011g185cdSXvg9shChJYA9qH
</commit_message>
<xml_diff>
--- a/rivrtech-rcc-agreement/RIVRTECH_RCC_Student_Athlete_Sponsorship_Internship_Agreement.docx
+++ b/rivrtech-rcc-agreement/RIVRTECH_RCC_Student_Athlete_Sponsorship_Internship_Agreement.docx
@@ -2486,26 +2486,7 @@
           <w:i w:val="0"/>
           <w:sz w:val="22"/>
         </w:rPr>
-        <w:t xml:space="preserve">6.2  Maximum Compensation. The Student-Athlete may earn up to </w:t>
-      </w:r>
-      <w:r>
-        <w:rPr>
-          <w:rFonts w:ascii="Arial" w:hAnsi="Arial" w:cs="Arial"/>
-          <w:b w:val="0"/>
-          <w:i w:val="0"/>
-          <w:sz w:val="22"/>
-          <w:highlight w:val="yellow"/>
-        </w:rPr>
-        <w:t>$[MAXIMUM DOLLAR AMOUNT]</w:t>
-      </w:r>
-      <w:r>
-        <w:rPr>
-          <w:rFonts w:ascii="Arial" w:hAnsi="Arial" w:cs="Arial"/>
-          <w:b w:val="0"/>
-          <w:i w:val="0"/>
-          <w:sz w:val="22"/>
-        </w:rPr>
-        <w:t xml:space="preserve"> in total gross wages during the Agreement Term (the “Maximum Compensation”).</w:t>
+        <w:t>6.2  Maximum Compensation. The Student-Athlete may earn up to $2,000.00 in total gross wages during the Agreement Term (the “Maximum Compensation”).</w:t>
       </w:r>
     </w:p>
     <w:p>
@@ -2549,59 +2530,7 @@
           <w:i/>
           <w:sz w:val="22"/>
         </w:rPr>
-        <w:t xml:space="preserve">“At a maximum compensation amount of </w:t>
-      </w:r>
-      <w:r>
-        <w:rPr>
-          <w:rFonts w:ascii="Arial" w:hAnsi="Arial" w:cs="Arial"/>
-          <w:b w:val="0"/>
-          <w:i/>
-          <w:sz w:val="22"/>
-          <w:highlight w:val="yellow"/>
-        </w:rPr>
-        <w:t>$[MAXIMUM DOLLAR AMOUNT]</w:t>
-      </w:r>
-      <w:r>
-        <w:rPr>
-          <w:rFonts w:ascii="Arial" w:hAnsi="Arial" w:cs="Arial"/>
-          <w:b w:val="0"/>
-          <w:i/>
-          <w:sz w:val="22"/>
-        </w:rPr>
-        <w:t xml:space="preserve"> and an hourly wage of $20.00, the Student-Athlete may work up to </w:t>
-      </w:r>
-      <w:r>
-        <w:rPr>
-          <w:rFonts w:ascii="Arial" w:hAnsi="Arial" w:cs="Arial"/>
-          <w:b w:val="0"/>
-          <w:i/>
-          <w:sz w:val="22"/>
-          <w:highlight w:val="yellow"/>
-        </w:rPr>
-        <w:t>[MAXIMUM DOLLAR AMOUNT ÷ 20]</w:t>
-      </w:r>
-      <w:r>
-        <w:rPr>
-          <w:rFonts w:ascii="Arial" w:hAnsi="Arial" w:cs="Arial"/>
-          <w:b w:val="0"/>
-          <w:i/>
-          <w:sz w:val="22"/>
-        </w:rPr>
-        <w:t xml:space="preserve"> authorized hours during the Agreement Term.”</w:t>
-      </w:r>
-    </w:p>
-    <w:p>
-      <w:pPr>
-        <w:spacing w:after="120" w:before="0"/>
-      </w:pPr>
-      <w:r>
-        <w:rPr>
-          <w:rFonts w:ascii="Arial" w:hAnsi="Arial" w:cs="Arial"/>
-          <w:b w:val="0"/>
-          <w:i w:val="0"/>
-          <w:sz w:val="18"/>
-        </w:rPr>
-        <w:t>For reference only (not the operative figure — insert the agreed amount above): $2,500 = 125 hours; $5,000 = 250 hours; $7,500 = 375 hours; $10,000 = 500 hours.</w:t>
+        <w:t>“At a maximum compensation amount of $2,000.00 and an hourly wage of $20.00, the Student-Athlete may work up to 100 authorized hours during the Agreement Term.”</w:t>
       </w:r>
     </w:p>
     <w:p>
@@ -7603,18 +7532,8 @@
                 <w:b w:val="0"/>
                 <w:i w:val="0"/>
                 <w:sz w:val="20"/>
-                <w:highlight w:val="yellow"/>
               </w:rPr>
-              <w:t>$[MAXIMUM DOLLAR AMOUNT]</w:t>
-            </w:r>
-            <w:r>
-              <w:rPr>
-                <w:rFonts w:ascii="Arial" w:hAnsi="Arial" w:cs="Arial"/>
-                <w:b w:val="0"/>
-                <w:i w:val="0"/>
-                <w:sz w:val="20"/>
-              </w:rPr>
-              <w:t xml:space="preserve"> gross</w:t>
+              <w:t>$2,000.00 gross</w:t>
             </w:r>
           </w:p>
         </w:tc>
@@ -7655,18 +7574,8 @@
                 <w:b w:val="0"/>
                 <w:i w:val="0"/>
                 <w:sz w:val="20"/>
-                <w:highlight w:val="yellow"/>
               </w:rPr>
-              <w:t>[MAXIMUM DOLLAR AMOUNT ÷ 20]</w:t>
-            </w:r>
-            <w:r>
-              <w:rPr>
-                <w:rFonts w:ascii="Arial" w:hAnsi="Arial" w:cs="Arial"/>
-                <w:b w:val="0"/>
-                <w:i w:val="0"/>
-                <w:sz w:val="20"/>
-              </w:rPr>
-              <w:t xml:space="preserve"> authorized hours</w:t>
+              <w:t>100 authorized hours</w:t>
             </w:r>
           </w:p>
         </w:tc>

</xml_diff>

<commit_message>
Leave RCC and Student-Athlete signature blocks empty
Replace the [AUTHORIZED REPRESENTATIVE]/[TITLE] and [FULL LEGAL NAME] placeholder
text in the RCC and Student-Athlete signature blocks with blank fill-in lines, to
be completed by hand at signing. RIVRTECH block keeps John Dyson / Chief
Operations Officer. ZIP 28372 confirmed by owner.

Co-Authored-By: Claude Opus 4.8 <noreply@anthropic.com>
Claude-Session: https://claude.ai/code/session_011g185cdSXvg9shChJYA9qH
</commit_message>
<xml_diff>
--- a/rivrtech-rcc-agreement/RIVRTECH_RCC_Student_Athlete_Sponsorship_Internship_Agreement.docx
+++ b/rivrtech-rcc-agreement/RIVRTECH_RCC_Student_Athlete_Sponsorship_Internship_Agreement.docx
@@ -6640,9 +6640,8 @@
           <w:b w:val="0"/>
           <w:i w:val="0"/>
           <w:sz w:val="22"/>
-          <w:highlight w:val="yellow"/>
-        </w:rPr>
-        <w:t>[AUTHORIZED REPRESENTATIVE]</w:t>
+        </w:rPr>
+        <w:t>______________________________________________</w:t>
       </w:r>
     </w:p>
     <w:p>
@@ -6664,9 +6663,8 @@
           <w:b w:val="0"/>
           <w:i w:val="0"/>
           <w:sz w:val="22"/>
-          <w:highlight w:val="yellow"/>
-        </w:rPr>
-        <w:t>[TITLE]</w:t>
+        </w:rPr>
+        <w:t>______________________________________________</w:t>
       </w:r>
     </w:p>
     <w:p>
@@ -6748,9 +6746,8 @@
           <w:b w:val="0"/>
           <w:i w:val="0"/>
           <w:sz w:val="22"/>
-          <w:highlight w:val="yellow"/>
-        </w:rPr>
-        <w:t>[FULL LEGAL NAME]</w:t>
+        </w:rPr>
+        <w:t>______________________________________________</w:t>
       </w:r>
     </w:p>
     <w:p>

</xml_diff>

<commit_message>
Name student-athlete as Lezlie Jackson
Fill Lezlie Jackson into the party-identification fields (title page, preamble,
party table, notices) and the checklist doc-control. Signature blocks remain
blank for hand-signing per prior instruction; her address/email/phone stay as
execution-time fields. Regenerated Word docs and PDF.

Co-Authored-By: Claude Opus 4.8 <noreply@anthropic.com>
Claude-Session: https://claude.ai/code/session_011g185cdSXvg9shChJYA9qH
</commit_message>
<xml_diff>
--- a/rivrtech-rcc-agreement/RIVRTECH_RCC_Student_Athlete_Sponsorship_Internship_Agreement.docx
+++ b/rivrtech-rcc-agreement/RIVRTECH_RCC_Student_Athlete_Sponsorship_Internship_Agreement.docx
@@ -140,9 +140,8 @@
           <w:b/>
           <w:i w:val="0"/>
           <w:sz w:val="26"/>
-          <w:highlight w:val="yellow"/>
-        </w:rPr>
-        <w:t>[STUDENT-ATHLETE’S FULL LEGAL NAME]</w:t>
+        </w:rPr>
+        <w:t>Lezlie Jackson</w:t>
       </w:r>
     </w:p>
     <w:p>
@@ -1209,26 +1208,7 @@
           <w:i w:val="0"/>
           <w:sz w:val="22"/>
         </w:rPr>
-        <w:t xml:space="preserve">This Student-Athlete Corporate Sponsorship and Paid Internship Agreement (this “Agreement”) is entered into as of the date of the last signature below (the “Effective Date”), by and among LREMC Technologies, LLC d/b/a RIVR Tech (“RIVR Tech”); Robeson Community College (“RCC” or the “College”); and </w:t>
-      </w:r>
-      <w:r>
-        <w:rPr>
-          <w:rFonts w:ascii="Arial" w:hAnsi="Arial" w:cs="Arial"/>
-          <w:b w:val="0"/>
-          <w:i w:val="0"/>
-          <w:sz w:val="22"/>
-          <w:highlight w:val="yellow"/>
-        </w:rPr>
-        <w:t>[STUDENT-ATHLETE’S FULL LEGAL NAME]</w:t>
-      </w:r>
-      <w:r>
-        <w:rPr>
-          <w:rFonts w:ascii="Arial" w:hAnsi="Arial" w:cs="Arial"/>
-          <w:b w:val="0"/>
-          <w:i w:val="0"/>
-          <w:sz w:val="22"/>
-        </w:rPr>
-        <w:t xml:space="preserve"> (the “Student-Athlete”). RIVR Tech, RCC, and the Student-Athlete are each a “Party” and together the “Parties.”</w:t>
+        <w:t>This Student-Athlete Corporate Sponsorship and Paid Internship Agreement (this “Agreement”) is entered into as of the date of the last signature below (the “Effective Date”), by and among LREMC Technologies, LLC d/b/a RIVR Tech (“RIVR Tech”); Robeson Community College (“RCC” or the “College”); and Lezlie Jackson (the “Student-Athlete”). RIVR Tech, RCC, and the Student-Athlete are each a “Party” and together the “Parties.”</w:t>
       </w:r>
     </w:p>
     <w:p>
@@ -1699,9 +1679,8 @@
                 <w:b w:val="0"/>
                 <w:i w:val="0"/>
                 <w:sz w:val="20"/>
-                <w:highlight w:val="yellow"/>
               </w:rPr>
-              <w:t>[STUDENT-ATHLETE’S FULL LEGAL NAME]</w:t>
+              <w:t>Lezlie Jackson</w:t>
             </w:r>
           </w:p>
         </w:tc>
@@ -5924,17 +5903,8 @@
                 <w:b w:val="0"/>
                 <w:i w:val="0"/>
                 <w:sz w:val="20"/>
-                <w:highlight w:val="yellow"/>
               </w:rPr>
-              <w:t>[NAME]</w:t>
-            </w:r>
-            <w:r>
-              <w:rPr>
-                <w:rFonts w:ascii="Arial" w:hAnsi="Arial" w:cs="Arial"/>
-                <w:b w:val="0"/>
-                <w:i w:val="0"/>
-                <w:sz w:val="20"/>
-              </w:rPr>
+              <w:t>Lezlie Jackson</w:t>
             </w:r>
             <w:r>
               <w:rPr>

</xml_diff>